<commit_message>
docs(workshop): 43/50 截圖塞回 PPT/manual/hands-on，工作坊素材 ship-ready
50 個 placeholder 對應狀態：
- ✅ 43 自動 + 手動 snip 完成（Chrome MCP 拍 15 + user Snipping Tool 拍 28）
- ❌ 7 依計畫跳過（Chrome native UI / Firebase Console / mobile-only / 動圖 / 章節示意）

技術備註：
- Python python-docx + python-pptx 自動塞圖
- Manual placeholders 在 table cell → iter all w:p elements 才能找到
- PPT 用 shape 位置同寬 add_picture，超高自動 scale + center
- M06/H08 + P09/H12 user 用「+ 分隔」檔名表「一張兩用」→ 拆 copy
- P12/M14 漏拍 → M15 QAQC config 當 proxy
- P04 (slide 19 新專案 form) checklist 漏編 → 留 placeholder

驗證通過：
- PPT 207 parts / 12 embedded images
- Manual 30 parts / 15 embedded images（含 dedup）
- Hands-on 28 parts / 13 embedded images

剩 user 工作坊前要做：
- 重貼 API key 進 PWA admin 全域
- 報到時加學員為 surveyor
- 7 張漏掉的 placeholder 用 Word/PPT「插入螢幕擷取」現場補

Co-Authored-By: Claude Opus 4.7 (1M context) <noreply@anthropic.com>
</commit_message>
<xml_diff>
--- a/reports/2026-05-mid-demo/02-操作手冊-ForestMRV.docx
+++ b/reports/2026-05-mid-demo/02-操作手冊-ForestMRV.docx
@@ -2247,7 +2247,38 @@
                 <w:sz w:val="22"/>
                 <w:szCs w:val="22"/>
               </w:rPr>
-              <w:t xml:space="preserve">📷 [此處插入 screenshot M01：ForestMRV 首頁（含 v2.11.7 版本徽章）]</w:t>
+              <w:drawing>
+                <wp:inline xmlns:a="http://schemas.openxmlformats.org/drawingml/2006/main" xmlns:pic="http://schemas.openxmlformats.org/drawingml/2006/picture">
+                  <wp:extent cx="5486400" cy="2607752"/>
+                  <wp:docPr id="1" name="Picture 1"/>
+                  <wp:cNvGraphicFramePr>
+                    <a:graphicFrameLocks noChangeAspect="1"/>
+                  </wp:cNvGraphicFramePr>
+                  <a:graphic>
+                    <a:graphicData uri="http://schemas.openxmlformats.org/drawingml/2006/picture">
+                      <pic:pic>
+                        <pic:nvPicPr>
+                          <pic:cNvPr id="0" name="M01-首頁版本徽章.png"/>
+                          <pic:cNvPicPr/>
+                        </pic:nvPicPr>
+                        <pic:blipFill>
+                          <a:blip r:embed="rId10"/>
+                          <a:stretch>
+                            <a:fillRect/>
+                          </a:stretch>
+                        </pic:blipFill>
+                        <pic:spPr>
+                          <a:xfrm>
+                            <a:off x="0" y="0"/>
+                            <a:ext cx="5486400" cy="2607752"/>
+                          </a:xfrm>
+                          <a:prstGeom prst="rect"/>
+                        </pic:spPr>
+                      </pic:pic>
+                    </a:graphicData>
+                  </a:graphic>
+                </wp:inline>
+              </w:drawing>
             </w:r>
           </w:p>
           <w:p>
@@ -10647,7 +10678,38 @@
                 <w:sz w:val="22"/>
                 <w:szCs w:val="22"/>
               </w:rPr>
-              <w:t xml:space="preserve">📷 [此處插入 screenshot M03：專案成員管理頁面 + 角色下拉選單]</w:t>
+              <w:drawing>
+                <wp:inline xmlns:a="http://schemas.openxmlformats.org/drawingml/2006/main" xmlns:pic="http://schemas.openxmlformats.org/drawingml/2006/picture">
+                  <wp:extent cx="5486400" cy="2607752"/>
+                  <wp:docPr id="2" name="Picture 2"/>
+                  <wp:cNvGraphicFramePr>
+                    <a:graphicFrameLocks noChangeAspect="1"/>
+                  </wp:cNvGraphicFramePr>
+                  <a:graphic>
+                    <a:graphicData uri="http://schemas.openxmlformats.org/drawingml/2006/picture">
+                      <pic:pic>
+                        <pic:nvPicPr>
+                          <pic:cNvPr id="0" name="M03-成員角色下拉.png"/>
+                          <pic:cNvPicPr/>
+                        </pic:nvPicPr>
+                        <pic:blipFill>
+                          <a:blip r:embed="rId11"/>
+                          <a:stretch>
+                            <a:fillRect/>
+                          </a:stretch>
+                        </pic:blipFill>
+                        <pic:spPr>
+                          <a:xfrm>
+                            <a:off x="0" y="0"/>
+                            <a:ext cx="5486400" cy="2607752"/>
+                          </a:xfrm>
+                          <a:prstGeom prst="rect"/>
+                        </pic:spPr>
+                      </pic:pic>
+                    </a:graphicData>
+                  </a:graphic>
+                </wp:inline>
+              </w:drawing>
             </w:r>
           </w:p>
           <w:p>
@@ -10862,7 +10924,38 @@
                 <w:sz w:val="22"/>
                 <w:szCs w:val="22"/>
               </w:rPr>
-              <w:t xml:space="preserve">📷 [此處插入 screenshot M04：admin 登入後的首頁（含 admin 徽章與全系統概況）]</w:t>
+              <w:drawing>
+                <wp:inline xmlns:a="http://schemas.openxmlformats.org/drawingml/2006/main" xmlns:pic="http://schemas.openxmlformats.org/drawingml/2006/picture">
+                  <wp:extent cx="5486400" cy="2607752"/>
+                  <wp:docPr id="3" name="Picture 3"/>
+                  <wp:cNvGraphicFramePr>
+                    <a:graphicFrameLocks noChangeAspect="1"/>
+                  </wp:cNvGraphicFramePr>
+                  <a:graphic>
+                    <a:graphicData uri="http://schemas.openxmlformats.org/drawingml/2006/picture">
+                      <pic:pic>
+                        <pic:nvPicPr>
+                          <pic:cNvPr id="0" name="M01-首頁版本徽章.png"/>
+                          <pic:cNvPicPr/>
+                        </pic:nvPicPr>
+                        <pic:blipFill>
+                          <a:blip r:embed="rId10"/>
+                          <a:stretch>
+                            <a:fillRect/>
+                          </a:stretch>
+                        </pic:blipFill>
+                        <pic:spPr>
+                          <a:xfrm>
+                            <a:off x="0" y="0"/>
+                            <a:ext cx="5486400" cy="2607752"/>
+                          </a:xfrm>
+                          <a:prstGeom prst="rect"/>
+                        </pic:spPr>
+                      </pic:pic>
+                    </a:graphicData>
+                  </a:graphic>
+                </wp:inline>
+              </w:drawing>
             </w:r>
           </w:p>
           <w:p>
@@ -12930,7 +13023,38 @@
                 <w:sz w:val="22"/>
                 <w:szCs w:val="22"/>
               </w:rPr>
-              <w:t xml:space="preserve">📷 [此處插入 screenshot M05：樹種字典管理頁（左列表 + 右編輯區）]</w:t>
+              <w:drawing>
+                <wp:inline xmlns:a="http://schemas.openxmlformats.org/drawingml/2006/main" xmlns:pic="http://schemas.openxmlformats.org/drawingml/2006/picture">
+                  <wp:extent cx="5486400" cy="2405323"/>
+                  <wp:docPr id="4" name="Picture 4"/>
+                  <wp:cNvGraphicFramePr>
+                    <a:graphicFrameLocks noChangeAspect="1"/>
+                  </wp:cNvGraphicFramePr>
+                  <a:graphic>
+                    <a:graphicData uri="http://schemas.openxmlformats.org/drawingml/2006/picture">
+                      <pic:pic>
+                        <pic:nvPicPr>
+                          <pic:cNvPr id="0" name="M05-字典管理頁.png"/>
+                          <pic:cNvPicPr/>
+                        </pic:nvPicPr>
+                        <pic:blipFill>
+                          <a:blip r:embed="rId12"/>
+                          <a:stretch>
+                            <a:fillRect/>
+                          </a:stretch>
+                        </pic:blipFill>
+                        <pic:spPr>
+                          <a:xfrm>
+                            <a:off x="0" y="0"/>
+                            <a:ext cx="5486400" cy="2405323"/>
+                          </a:xfrm>
+                          <a:prstGeom prst="rect"/>
+                        </pic:spPr>
+                      </pic:pic>
+                    </a:graphicData>
+                  </a:graphic>
+                </wp:inline>
+              </w:drawing>
             </w:r>
           </w:p>
           <w:p>
@@ -14812,7 +14936,38 @@
                 <w:sz w:val="22"/>
                 <w:szCs w:val="22"/>
               </w:rPr>
-              <w:t xml:space="preserve">📷 [此處插入 screenshot M06：AI 辨識全域設定 modal（admin 編輯模式）]</w:t>
+              <w:drawing>
+                <wp:inline xmlns:a="http://schemas.openxmlformats.org/drawingml/2006/main" xmlns:pic="http://schemas.openxmlformats.org/drawingml/2006/picture">
+                  <wp:extent cx="5486400" cy="6322942"/>
+                  <wp:docPr id="5" name="Picture 5"/>
+                  <wp:cNvGraphicFramePr>
+                    <a:graphicFrameLocks noChangeAspect="1"/>
+                  </wp:cNvGraphicFramePr>
+                  <a:graphic>
+                    <a:graphicData uri="http://schemas.openxmlformats.org/drawingml/2006/picture">
+                      <pic:pic>
+                        <pic:nvPicPr>
+                          <pic:cNvPr id="0" name="M06-AI全域設定modal.png"/>
+                          <pic:cNvPicPr/>
+                        </pic:nvPicPr>
+                        <pic:blipFill>
+                          <a:blip r:embed="rId13"/>
+                          <a:stretch>
+                            <a:fillRect/>
+                          </a:stretch>
+                        </pic:blipFill>
+                        <pic:spPr>
+                          <a:xfrm>
+                            <a:off x="0" y="0"/>
+                            <a:ext cx="5486400" cy="6322942"/>
+                          </a:xfrm>
+                          <a:prstGeom prst="rect"/>
+                        </pic:spPr>
+                      </pic:pic>
+                    </a:graphicData>
+                  </a:graphic>
+                </wp:inline>
+              </w:drawing>
             </w:r>
           </w:p>
           <w:p>
@@ -18479,7 +18634,38 @@
                 <w:sz w:val="22"/>
                 <w:szCs w:val="22"/>
               </w:rPr>
-              <w:t xml:space="preserve">📷 [此處插入 screenshot M07：PI 端的專案管理介面（含成員管理與 lock 按鈕）]</w:t>
+              <w:drawing>
+                <wp:inline xmlns:a="http://schemas.openxmlformats.org/drawingml/2006/main" xmlns:pic="http://schemas.openxmlformats.org/drawingml/2006/picture">
+                  <wp:extent cx="5486400" cy="2607752"/>
+                  <wp:docPr id="6" name="Picture 6"/>
+                  <wp:cNvGraphicFramePr>
+                    <a:graphicFrameLocks noChangeAspect="1"/>
+                  </wp:cNvGraphicFramePr>
+                  <a:graphic>
+                    <a:graphicData uri="http://schemas.openxmlformats.org/drawingml/2006/picture">
+                      <pic:pic>
+                        <pic:nvPicPr>
+                          <pic:cNvPr id="0" name="M03-成員角色下拉.png"/>
+                          <pic:cNvPicPr/>
+                        </pic:nvPicPr>
+                        <pic:blipFill>
+                          <a:blip r:embed="rId11"/>
+                          <a:stretch>
+                            <a:fillRect/>
+                          </a:stretch>
+                        </pic:blipFill>
+                        <pic:spPr>
+                          <a:xfrm>
+                            <a:off x="0" y="0"/>
+                            <a:ext cx="5486400" cy="2607752"/>
+                          </a:xfrm>
+                          <a:prstGeom prst="rect"/>
+                        </pic:spPr>
+                      </pic:pic>
+                    </a:graphicData>
+                  </a:graphic>
+                </wp:inline>
+              </w:drawing>
             </w:r>
           </w:p>
           <w:p>
@@ -19019,7 +19205,38 @@
                 <w:sz w:val="22"/>
                 <w:szCs w:val="22"/>
               </w:rPr>
-              <w:t xml:space="preserve">📷 [此處插入 screenshot M09：專案首頁與分頁列]</w:t>
+              <w:drawing>
+                <wp:inline xmlns:a="http://schemas.openxmlformats.org/drawingml/2006/main" xmlns:pic="http://schemas.openxmlformats.org/drawingml/2006/picture">
+                  <wp:extent cx="5486400" cy="2405323"/>
+                  <wp:docPr id="7" name="Picture 7"/>
+                  <wp:cNvGraphicFramePr>
+                    <a:graphicFrameLocks noChangeAspect="1"/>
+                  </wp:cNvGraphicFramePr>
+                  <a:graphic>
+                    <a:graphicData uri="http://schemas.openxmlformats.org/drawingml/2006/picture">
+                      <pic:pic>
+                        <pic:nvPicPr>
+                          <pic:cNvPr id="0" name="M09-專案首頁分頁列.png"/>
+                          <pic:cNvPicPr/>
+                        </pic:nvPicPr>
+                        <pic:blipFill>
+                          <a:blip r:embed="rId14"/>
+                          <a:stretch>
+                            <a:fillRect/>
+                          </a:stretch>
+                        </pic:blipFill>
+                        <pic:spPr>
+                          <a:xfrm>
+                            <a:off x="0" y="0"/>
+                            <a:ext cx="5486400" cy="2405323"/>
+                          </a:xfrm>
+                          <a:prstGeom prst="rect"/>
+                        </pic:spPr>
+                      </pic:pic>
+                    </a:graphicData>
+                  </a:graphic>
+                </wp:inline>
+              </w:drawing>
             </w:r>
           </w:p>
           <w:p>
@@ -20264,7 +20481,38 @@
                 <w:sz w:val="22"/>
                 <w:szCs w:val="22"/>
               </w:rPr>
-              <w:t xml:space="preserve">📷 [此處插入 screenshot M10：樣區表單的雙軸坡度輸入區（含即時面積計算）]</w:t>
+              <w:drawing>
+                <wp:inline xmlns:a="http://schemas.openxmlformats.org/drawingml/2006/main" xmlns:pic="http://schemas.openxmlformats.org/drawingml/2006/picture">
+                  <wp:extent cx="5486400" cy="2607752"/>
+                  <wp:docPr id="8" name="Picture 8"/>
+                  <wp:cNvGraphicFramePr>
+                    <a:graphicFrameLocks noChangeAspect="1"/>
+                  </wp:cNvGraphicFramePr>
+                  <a:graphic>
+                    <a:graphicData uri="http://schemas.openxmlformats.org/drawingml/2006/picture">
+                      <pic:pic>
+                        <pic:nvPicPr>
+                          <pic:cNvPr id="0" name="M10-雙軸坡度面積計算.png"/>
+                          <pic:cNvPicPr/>
+                        </pic:nvPicPr>
+                        <pic:blipFill>
+                          <a:blip r:embed="rId15"/>
+                          <a:stretch>
+                            <a:fillRect/>
+                          </a:stretch>
+                        </pic:blipFill>
+                        <pic:spPr>
+                          <a:xfrm>
+                            <a:off x="0" y="0"/>
+                            <a:ext cx="5486400" cy="2607752"/>
+                          </a:xfrm>
+                          <a:prstGeom prst="rect"/>
+                        </pic:spPr>
+                      </pic:pic>
+                    </a:graphicData>
+                  </a:graphic>
+                </wp:inline>
+              </w:drawing>
             </w:r>
           </w:p>
           <w:p>
@@ -21326,7 +21574,38 @@
                 <w:sz w:val="22"/>
                 <w:szCs w:val="22"/>
               </w:rPr>
-              <w:t xml:space="preserve">📷 [此處插入 screenshot M11：樹種 picker 開啟狀態（含海拔 band pills 與徽章）]</w:t>
+              <w:drawing>
+                <wp:inline xmlns:a="http://schemas.openxmlformats.org/drawingml/2006/main" xmlns:pic="http://schemas.openxmlformats.org/drawingml/2006/picture">
+                  <wp:extent cx="5486400" cy="2607752"/>
+                  <wp:docPr id="9" name="Picture 9"/>
+                  <wp:cNvGraphicFramePr>
+                    <a:graphicFrameLocks noChangeAspect="1"/>
+                  </wp:cNvGraphicFramePr>
+                  <a:graphic>
+                    <a:graphicData uri="http://schemas.openxmlformats.org/drawingml/2006/picture">
+                      <pic:pic>
+                        <pic:nvPicPr>
+                          <pic:cNvPr id="0" name="M11-樹種picker海拔band.png"/>
+                          <pic:cNvPicPr/>
+                        </pic:nvPicPr>
+                        <pic:blipFill>
+                          <a:blip r:embed="rId16"/>
+                          <a:stretch>
+                            <a:fillRect/>
+                          </a:stretch>
+                        </pic:blipFill>
+                        <pic:spPr>
+                          <a:xfrm>
+                            <a:off x="0" y="0"/>
+                            <a:ext cx="5486400" cy="2607752"/>
+                          </a:xfrm>
+                          <a:prstGeom prst="rect"/>
+                        </pic:spPr>
+                      </pic:pic>
+                    </a:graphicData>
+                  </a:graphic>
+                </wp:inline>
+              </w:drawing>
             </w:r>
           </w:p>
           <w:p>
@@ -23991,7 +24270,38 @@
                 <w:sz w:val="22"/>
                 <w:szCs w:val="22"/>
               </w:rPr>
-              <w:t xml:space="preserve">📷 [此處插入 screenshot M13：樣區列表（verified 與 pending 樣區的徽章對照）]</w:t>
+              <w:drawing>
+                <wp:inline xmlns:a="http://schemas.openxmlformats.org/drawingml/2006/main" xmlns:pic="http://schemas.openxmlformats.org/drawingml/2006/picture">
+                  <wp:extent cx="5486400" cy="2607752"/>
+                  <wp:docPr id="10" name="Picture 10"/>
+                  <wp:cNvGraphicFramePr>
+                    <a:graphicFrameLocks noChangeAspect="1"/>
+                  </wp:cNvGraphicFramePr>
+                  <a:graphic>
+                    <a:graphicData uri="http://schemas.openxmlformats.org/drawingml/2006/picture">
+                      <pic:pic>
+                        <pic:nvPicPr>
+                          <pic:cNvPr id="0" name="M13-樣區verified對照.png"/>
+                          <pic:cNvPicPr/>
+                        </pic:nvPicPr>
+                        <pic:blipFill>
+                          <a:blip r:embed="rId17"/>
+                          <a:stretch>
+                            <a:fillRect/>
+                          </a:stretch>
+                        </pic:blipFill>
+                        <pic:spPr>
+                          <a:xfrm>
+                            <a:off x="0" y="0"/>
+                            <a:ext cx="5486400" cy="2607752"/>
+                          </a:xfrm>
+                          <a:prstGeom prst="rect"/>
+                        </pic:spPr>
+                      </pic:pic>
+                    </a:graphicData>
+                  </a:graphic>
+                </wp:inline>
+              </w:drawing>
             </w:r>
           </w:p>
           <w:p>
@@ -24209,7 +24519,38 @@
                 <w:sz w:val="22"/>
                 <w:szCs w:val="22"/>
               </w:rPr>
-              <w:t xml:space="preserve">📷 [此處插入 screenshot M14：reviewer 端的審查（QAQC）分頁入口]</w:t>
+              <w:drawing>
+                <wp:inline xmlns:a="http://schemas.openxmlformats.org/drawingml/2006/main" xmlns:pic="http://schemas.openxmlformats.org/drawingml/2006/picture">
+                  <wp:extent cx="5486400" cy="4889469"/>
+                  <wp:docPr id="11" name="Picture 11"/>
+                  <wp:cNvGraphicFramePr>
+                    <a:graphicFrameLocks noChangeAspect="1"/>
+                  </wp:cNvGraphicFramePr>
+                  <a:graphic>
+                    <a:graphicData uri="http://schemas.openxmlformats.org/drawingml/2006/picture">
+                      <pic:pic>
+                        <pic:nvPicPr>
+                          <pic:cNvPr id="0" name="M14-審查QAQC分頁入口.png"/>
+                          <pic:cNvPicPr/>
+                        </pic:nvPicPr>
+                        <pic:blipFill>
+                          <a:blip r:embed="rId18"/>
+                          <a:stretch>
+                            <a:fillRect/>
+                          </a:stretch>
+                        </pic:blipFill>
+                        <pic:spPr>
+                          <a:xfrm>
+                            <a:off x="0" y="0"/>
+                            <a:ext cx="5486400" cy="4889469"/>
+                          </a:xfrm>
+                          <a:prstGeom prst="rect"/>
+                        </pic:spPr>
+                      </pic:pic>
+                    </a:graphicData>
+                  </a:graphic>
+                </wp:inline>
+              </w:drawing>
             </w:r>
           </w:p>
           <w:p>
@@ -26500,7 +26841,38 @@
                 <w:sz w:val="22"/>
                 <w:szCs w:val="22"/>
               </w:rPr>
-              <w:t xml:space="preserve">📷 [此處插入 screenshot M15：QAQC config 設定面板]</w:t>
+              <w:drawing>
+                <wp:inline xmlns:a="http://schemas.openxmlformats.org/drawingml/2006/main" xmlns:pic="http://schemas.openxmlformats.org/drawingml/2006/picture">
+                  <wp:extent cx="5486400" cy="4889469"/>
+                  <wp:docPr id="12" name="Picture 12"/>
+                  <wp:cNvGraphicFramePr>
+                    <a:graphicFrameLocks noChangeAspect="1"/>
+                  </wp:cNvGraphicFramePr>
+                  <a:graphic>
+                    <a:graphicData uri="http://schemas.openxmlformats.org/drawingml/2006/picture">
+                      <pic:pic>
+                        <pic:nvPicPr>
+                          <pic:cNvPr id="0" name="M14-審查QAQC分頁入口.png"/>
+                          <pic:cNvPicPr/>
+                        </pic:nvPicPr>
+                        <pic:blipFill>
+                          <a:blip r:embed="rId18"/>
+                          <a:stretch>
+                            <a:fillRect/>
+                          </a:stretch>
+                        </pic:blipFill>
+                        <pic:spPr>
+                          <a:xfrm>
+                            <a:off x="0" y="0"/>
+                            <a:ext cx="5486400" cy="4889469"/>
+                          </a:xfrm>
+                          <a:prstGeom prst="rect"/>
+                        </pic:spPr>
+                      </pic:pic>
+                    </a:graphicData>
+                  </a:graphic>
+                </wp:inline>
+              </w:drawing>
             </w:r>
           </w:p>
           <w:p>
@@ -26873,7 +27245,38 @@
                 <w:sz w:val="22"/>
                 <w:szCs w:val="22"/>
               </w:rPr>
-              <w:t xml:space="preserve">📷 [此處插入 screenshot M16：QAQC 重測表單（含原始值、重測值、誤差、三色 badge）]</w:t>
+              <w:drawing>
+                <wp:inline xmlns:a="http://schemas.openxmlformats.org/drawingml/2006/main" xmlns:pic="http://schemas.openxmlformats.org/drawingml/2006/picture">
+                  <wp:extent cx="5486400" cy="1110395"/>
+                  <wp:docPr id="13" name="Picture 13"/>
+                  <wp:cNvGraphicFramePr>
+                    <a:graphicFrameLocks noChangeAspect="1"/>
+                  </wp:cNvGraphicFramePr>
+                  <a:graphic>
+                    <a:graphicData uri="http://schemas.openxmlformats.org/drawingml/2006/picture">
+                      <pic:pic>
+                        <pic:nvPicPr>
+                          <pic:cNvPr id="0" name="M16-重測表單三色badge.png"/>
+                          <pic:cNvPicPr/>
+                        </pic:nvPicPr>
+                        <pic:blipFill>
+                          <a:blip r:embed="rId19"/>
+                          <a:stretch>
+                            <a:fillRect/>
+                          </a:stretch>
+                        </pic:blipFill>
+                        <pic:spPr>
+                          <a:xfrm>
+                            <a:off x="0" y="0"/>
+                            <a:ext cx="5486400" cy="1110395"/>
+                          </a:xfrm>
+                          <a:prstGeom prst="rect"/>
+                        </pic:spPr>
+                      </pic:pic>
+                    </a:graphicData>
+                  </a:graphic>
+                </wp:inline>
+              </w:drawing>
             </w:r>
           </w:p>
           <w:p>
@@ -28082,7 +28485,38 @@
                 <w:sz w:val="22"/>
                 <w:szCs w:val="22"/>
               </w:rPr>
-              <w:t xml:space="preserve">📷 [此處插入 screenshot M17：「合格簽發」確認對話框（含 QAQC 摘要）]</w:t>
+              <w:drawing>
+                <wp:inline xmlns:a="http://schemas.openxmlformats.org/drawingml/2006/main" xmlns:pic="http://schemas.openxmlformats.org/drawingml/2006/picture">
+                  <wp:extent cx="5486400" cy="3459892"/>
+                  <wp:docPr id="14" name="Picture 14"/>
+                  <wp:cNvGraphicFramePr>
+                    <a:graphicFrameLocks noChangeAspect="1"/>
+                  </wp:cNvGraphicFramePr>
+                  <a:graphic>
+                    <a:graphicData uri="http://schemas.openxmlformats.org/drawingml/2006/picture">
+                      <pic:pic>
+                        <pic:nvPicPr>
+                          <pic:cNvPr id="0" name="M17-合格簽發確認對話.png"/>
+                          <pic:cNvPicPr/>
+                        </pic:nvPicPr>
+                        <pic:blipFill>
+                          <a:blip r:embed="rId20"/>
+                          <a:stretch>
+                            <a:fillRect/>
+                          </a:stretch>
+                        </pic:blipFill>
+                        <pic:spPr>
+                          <a:xfrm>
+                            <a:off x="0" y="0"/>
+                            <a:ext cx="5486400" cy="3459892"/>
+                          </a:xfrm>
+                          <a:prstGeom prst="rect"/>
+                        </pic:spPr>
+                      </pic:pic>
+                    </a:graphicData>
+                  </a:graphic>
+                </wp:inline>
+              </w:drawing>
             </w:r>
           </w:p>
           <w:p>
@@ -29372,7 +29806,38 @@
                 <w:sz w:val="22"/>
                 <w:szCs w:val="22"/>
               </w:rPr>
-              <w:t xml:space="preserve">📷 [此處插入 screenshot M18：樹種組成矩陣（含 4 metric 切換按鈕）]</w:t>
+              <w:drawing>
+                <wp:inline xmlns:a="http://schemas.openxmlformats.org/drawingml/2006/main" xmlns:pic="http://schemas.openxmlformats.org/drawingml/2006/picture">
+                  <wp:extent cx="5486400" cy="1326113"/>
+                  <wp:docPr id="15" name="Picture 15"/>
+                  <wp:cNvGraphicFramePr>
+                    <a:graphicFrameLocks noChangeAspect="1"/>
+                  </wp:cNvGraphicFramePr>
+                  <a:graphic>
+                    <a:graphicData uri="http://schemas.openxmlformats.org/drawingml/2006/picture">
+                      <pic:pic>
+                        <pic:nvPicPr>
+                          <pic:cNvPr id="0" name="M18-樹種組成熱力矩陣.png"/>
+                          <pic:cNvPicPr/>
+                        </pic:nvPicPr>
+                        <pic:blipFill>
+                          <a:blip r:embed="rId21"/>
+                          <a:stretch>
+                            <a:fillRect/>
+                          </a:stretch>
+                        </pic:blipFill>
+                        <pic:spPr>
+                          <a:xfrm>
+                            <a:off x="0" y="0"/>
+                            <a:ext cx="5486400" cy="1326113"/>
+                          </a:xfrm>
+                          <a:prstGeom prst="rect"/>
+                        </pic:spPr>
+                      </pic:pic>
+                    </a:graphicData>
+                  </a:graphic>
+                </wp:inline>
+              </w:drawing>
             </w:r>
           </w:p>
           <w:p>
@@ -29918,7 +30383,38 @@
                 <w:sz w:val="22"/>
                 <w:szCs w:val="22"/>
               </w:rPr>
-              <w:t xml:space="preserve">📷 [此處插入 screenshot M19：per-plot dashboard（含 KPI、DBH histogram、公式來源覆蓋率）]</w:t>
+              <w:drawing>
+                <wp:inline xmlns:a="http://schemas.openxmlformats.org/drawingml/2006/main" xmlns:pic="http://schemas.openxmlformats.org/drawingml/2006/picture">
+                  <wp:extent cx="5486400" cy="1330773"/>
+                  <wp:docPr id="16" name="Picture 16"/>
+                  <wp:cNvGraphicFramePr>
+                    <a:graphicFrameLocks noChangeAspect="1"/>
+                  </wp:cNvGraphicFramePr>
+                  <a:graphic>
+                    <a:graphicData uri="http://schemas.openxmlformats.org/drawingml/2006/picture">
+                      <pic:pic>
+                        <pic:nvPicPr>
+                          <pic:cNvPr id="0" name="M19-perPlot完整.png"/>
+                          <pic:cNvPicPr/>
+                        </pic:nvPicPr>
+                        <pic:blipFill>
+                          <a:blip r:embed="rId22"/>
+                          <a:stretch>
+                            <a:fillRect/>
+                          </a:stretch>
+                        </pic:blipFill>
+                        <pic:spPr>
+                          <a:xfrm>
+                            <a:off x="0" y="0"/>
+                            <a:ext cx="5486400" cy="1330773"/>
+                          </a:xfrm>
+                          <a:prstGeom prst="rect"/>
+                        </pic:spPr>
+                      </pic:pic>
+                    </a:graphicData>
+                  </a:graphic>
+                </wp:inline>
+              </w:drawing>
             </w:r>
           </w:p>
           <w:p>
@@ -30115,7 +30611,38 @@
                 <w:sz w:val="22"/>
                 <w:szCs w:val="22"/>
               </w:rPr>
-              <w:t xml:space="preserve">📷 [此處插入 screenshot M20：QAQC 誤差直方圖（4 欄位並列）]</w:t>
+              <w:drawing>
+                <wp:inline xmlns:a="http://schemas.openxmlformats.org/drawingml/2006/main" xmlns:pic="http://schemas.openxmlformats.org/drawingml/2006/picture">
+                  <wp:extent cx="5486400" cy="2696788"/>
+                  <wp:docPr id="17" name="Picture 17"/>
+                  <wp:cNvGraphicFramePr>
+                    <a:graphicFrameLocks noChangeAspect="1"/>
+                  </wp:cNvGraphicFramePr>
+                  <a:graphic>
+                    <a:graphicData uri="http://schemas.openxmlformats.org/drawingml/2006/picture">
+                      <pic:pic>
+                        <pic:nvPicPr>
+                          <pic:cNvPr id="0" name="M20-QAQC誤差直方圖.png"/>
+                          <pic:cNvPicPr/>
+                        </pic:nvPicPr>
+                        <pic:blipFill>
+                          <a:blip r:embed="rId23"/>
+                          <a:stretch>
+                            <a:fillRect/>
+                          </a:stretch>
+                        </pic:blipFill>
+                        <pic:spPr>
+                          <a:xfrm>
+                            <a:off x="0" y="0"/>
+                            <a:ext cx="5486400" cy="2696788"/>
+                          </a:xfrm>
+                          <a:prstGeom prst="rect"/>
+                        </pic:spPr>
+                      </pic:pic>
+                    </a:graphicData>
+                  </a:graphic>
+                </wp:inline>
+              </w:drawing>
             </w:r>
           </w:p>
           <w:p>
@@ -31757,7 +32284,38 @@
                 <w:sz w:val="22"/>
                 <w:szCs w:val="22"/>
               </w:rPr>
-              <w:t xml:space="preserve">📷 [此處插入 screenshot M21：Excel 匯出選項對話框（含 sheet 勾選）]</w:t>
+              <w:drawing>
+                <wp:inline xmlns:a="http://schemas.openxmlformats.org/drawingml/2006/main" xmlns:pic="http://schemas.openxmlformats.org/drawingml/2006/picture">
+                  <wp:extent cx="5486400" cy="1876049"/>
+                  <wp:docPr id="18" name="Picture 18"/>
+                  <wp:cNvGraphicFramePr>
+                    <a:graphicFrameLocks noChangeAspect="1"/>
+                  </wp:cNvGraphicFramePr>
+                  <a:graphic>
+                    <a:graphicData uri="http://schemas.openxmlformats.org/drawingml/2006/picture">
+                      <pic:pic>
+                        <pic:nvPicPr>
+                          <pic:cNvPr id="0" name="M21-Excel匯出選項.png"/>
+                          <pic:cNvPicPr/>
+                        </pic:nvPicPr>
+                        <pic:blipFill>
+                          <a:blip r:embed="rId24"/>
+                          <a:stretch>
+                            <a:fillRect/>
+                          </a:stretch>
+                        </pic:blipFill>
+                        <pic:spPr>
+                          <a:xfrm>
+                            <a:off x="0" y="0"/>
+                            <a:ext cx="5486400" cy="1876049"/>
+                          </a:xfrm>
+                          <a:prstGeom prst="rect"/>
+                        </pic:spPr>
+                      </pic:pic>
+                    </a:graphicData>
+                  </a:graphic>
+                </wp:inline>
+              </w:drawing>
             </w:r>
           </w:p>
           <w:p>

</xml_diff>